<commit_message>
Changes related to DM
</commit_message>
<xml_diff>
--- a/PHOCS-Docgentemplates/ReceiptBCCDC PHOCS.docx
+++ b/PHOCS-Docgentemplates/ReceiptBCCDC PHOCS.docx
@@ -155,7 +155,7 @@
         <w:tblLook w:val="04A0" w:firstRow="1" w:lastRow="0" w:firstColumn="1" w:lastColumn="0" w:noHBand="0" w:noVBand="1"/>
       </w:tblPr>
       <w:tblGrid>
-        <w:gridCol w:w="5035"/>
+        <w:gridCol w:w="7560"/>
       </w:tblGrid>
       <w:tr>
         <w:trPr>
@@ -163,7 +163,7 @@
         </w:trPr>
         <w:tc>
           <w:tcPr>
-            <w:tcW w:w="5035" w:type="dxa"/>
+            <w:tcW w:w="7560" w:type="dxa"/>
           </w:tcPr>
           <w:p>
             <w:pPr>
@@ -183,7 +183,7 @@
         </w:trPr>
         <w:tc>
           <w:tcPr>
-            <w:tcW w:w="5035" w:type="dxa"/>
+            <w:tcW w:w="7560" w:type="dxa"/>
           </w:tcPr>
           <w:p>
             <w:pPr>
@@ -203,7 +203,7 @@
         </w:trPr>
         <w:tc>
           <w:tcPr>
-            <w:tcW w:w="5035" w:type="dxa"/>
+            <w:tcW w:w="7560" w:type="dxa"/>
           </w:tcPr>
           <w:p>
             <w:pPr>
@@ -223,7 +223,7 @@
         </w:trPr>
         <w:tc>
           <w:tcPr>
-            <w:tcW w:w="5035" w:type="dxa"/>
+            <w:tcW w:w="7560" w:type="dxa"/>
           </w:tcPr>
           <w:p>
             <w:pPr>
@@ -233,6 +233,55 @@
             </w:pPr>
             <w:r>
               <w:t>Burnaby, BC V5C 6E3</w:t>
+            </w:r>
+          </w:p>
+          <w:p>
+            <w:pPr>
+              <w:tabs>
+                <w:tab w:val="left" w:pos="5892"/>
+              </w:tabs>
+            </w:pPr>
+          </w:p>
+          <w:p>
+            <w:pPr>
+              <w:tabs>
+                <w:tab w:val="left" w:pos="5892"/>
+              </w:tabs>
+              <w:ind w:right="-290"/>
+              <w:jc w:val="center"/>
+              <w:rPr>
+                <w:b/>
+                <w:bCs/>
+                <w:i/>
+                <w:iCs/>
+              </w:rPr>
+            </w:pPr>
+            <w:r>
+              <w:rPr>
+                <w:b/>
+                <w:bCs/>
+                <w:i/>
+                <w:iCs/>
+              </w:rPr>
+              <w:t xml:space="preserve">                            </w:t>
+            </w:r>
+            <w:r>
+              <w:rPr>
+                <w:b/>
+                <w:bCs/>
+                <w:i/>
+                <w:iCs/>
+              </w:rPr>
+              <w:t>OFFICIAL RECEIPT – DUPLICAT</w:t>
+            </w:r>
+            <w:r>
+              <w:rPr>
+                <w:b/>
+                <w:bCs/>
+                <w:i/>
+                <w:iCs/>
+              </w:rPr>
+              <w:t>E</w:t>
             </w:r>
           </w:p>
         </w:tc>
@@ -259,204 +308,8 @@
           <w:sz w:val="20"/>
           <w:szCs w:val="20"/>
         </w:rPr>
-        <mc:AlternateContent>
-          <mc:Choice Requires="wps">
-            <w:drawing>
-              <wp:anchor distT="45720" distB="45720" distL="114300" distR="114300" simplePos="0" relativeHeight="251658242" behindDoc="0" locked="0" layoutInCell="1" allowOverlap="1" wp14:anchorId="5B557E22" wp14:editId="10EAF18E">
-                <wp:simplePos x="0" y="0"/>
-                <wp:positionH relativeFrom="margin">
-                  <wp:posOffset>1411834</wp:posOffset>
-                </wp:positionH>
-                <wp:positionV relativeFrom="page">
-                  <wp:posOffset>2772461</wp:posOffset>
-                </wp:positionV>
-                <wp:extent cx="2530271" cy="249381"/>
-                <wp:effectExtent l="0" t="0" r="22860" b="17780"/>
-                <wp:wrapNone/>
-                <wp:docPr id="971334610" name="Text Box 2"/>
-                <wp:cNvGraphicFramePr>
-                  <a:graphicFrameLocks xmlns:a="http://schemas.openxmlformats.org/drawingml/2006/main"/>
-                </wp:cNvGraphicFramePr>
-                <a:graphic xmlns:a="http://schemas.openxmlformats.org/drawingml/2006/main">
-                  <a:graphicData uri="http://schemas.microsoft.com/office/word/2010/wordprocessingShape">
-                    <wps:wsp>
-                      <wps:cNvSpPr txBox="1">
-                        <a:spLocks noChangeArrowheads="1"/>
-                      </wps:cNvSpPr>
-                      <wps:spPr bwMode="auto">
-                        <a:xfrm>
-                          <a:off x="0" y="0"/>
-                          <a:ext cx="2530271" cy="249381"/>
-                        </a:xfrm>
-                        <a:prstGeom prst="rect">
-                          <a:avLst/>
-                        </a:prstGeom>
-                        <a:solidFill>
-                          <a:srgbClr val="FFFFFF"/>
-                        </a:solidFill>
-                        <a:ln w="9525">
-                          <a:solidFill>
-                            <a:schemeClr val="bg1"/>
-                          </a:solidFill>
-                          <a:miter lim="800000"/>
-                          <a:headEnd/>
-                          <a:tailEnd/>
-                        </a:ln>
-                      </wps:spPr>
-                      <wps:txbx>
-                        <w:txbxContent>
-                          <w:p>
-                            <w:pPr>
-                              <w:jc w:val="center"/>
-                              <w:rPr>
-                                <w:b/>
-                                <w:bCs/>
-                                <w:i/>
-                                <w:iCs/>
-                              </w:rPr>
-                            </w:pPr>
-                            <w:r>
-                              <w:rPr>
-                                <w:b/>
-                                <w:bCs/>
-                                <w:i/>
-                                <w:iCs/>
-                              </w:rPr>
-                              <w:t>O</w:t>
-                            </w:r>
-                            <w:r>
-                              <w:rPr>
-                                <w:b/>
-                                <w:bCs/>
-                                <w:i/>
-                                <w:iCs/>
-                              </w:rPr>
-                              <w:t xml:space="preserve">FFICIAL RECEIPT </w:t>
-                            </w:r>
-                            <w:r>
-                              <w:rPr>
-                                <w:b/>
-                                <w:bCs/>
-                                <w:i/>
-                                <w:iCs/>
-                              </w:rPr>
-                              <w:t xml:space="preserve">– </w:t>
-                            </w:r>
-                            <w:r>
-                              <w:rPr>
-                                <w:b/>
-                                <w:bCs/>
-                                <w:i/>
-                                <w:iCs/>
-                              </w:rPr>
-                              <w:t>DUPLICATE</w:t>
-                            </w:r>
-                          </w:p>
-                        </w:txbxContent>
-                      </wps:txbx>
-                      <wps:bodyPr rot="0" vert="horz" wrap="square" lIns="91440" tIns="45720" rIns="91440" bIns="45720" anchor="t" anchorCtr="0">
-                        <a:noAutofit/>
-                      </wps:bodyPr>
-                    </wps:wsp>
-                  </a:graphicData>
-                </a:graphic>
-                <wp14:sizeRelH relativeFrom="margin">
-                  <wp14:pctWidth>0</wp14:pctWidth>
-                </wp14:sizeRelH>
-                <wp14:sizeRelV relativeFrom="margin">
-                  <wp14:pctHeight>0</wp14:pctHeight>
-                </wp14:sizeRelV>
-              </wp:anchor>
-            </w:drawing>
-          </mc:Choice>
-          <mc:Fallback>
-            <w:pict>
-              <v:shapetype w14:anchorId="5B557E22" id="_x0000_t202" coordsize="21600,21600" o:spt="202" path="m,l,21600r21600,l21600,xe">
-                <v:stroke joinstyle="miter"/>
-                <v:path gradientshapeok="t" o:connecttype="rect"/>
-              </v:shapetype>
-              <v:shape id="Text Box 2" o:spid="_x0000_s1026" type="#_x0000_t202" style="position:absolute;margin-left:111.15pt;margin-top:218.3pt;width:199.25pt;height:19.65pt;z-index:251658242;visibility:visible;mso-wrap-style:square;mso-width-percent:0;mso-height-percent:0;mso-wrap-distance-left:9pt;mso-wrap-distance-top:3.6pt;mso-wrap-distance-right:9pt;mso-wrap-distance-bottom:3.6pt;mso-position-horizontal:absolute;mso-position-horizontal-relative:margin;mso-position-vertical:absolute;mso-position-vertical-relative:page;mso-width-percent:0;mso-height-percent:0;mso-width-relative:margin;mso-height-relative:margin;v-text-anchor:top" o:gfxdata="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" strokecolor="white [3212]">
-                <v:textbox>
-                  <w:txbxContent>
-                    <w:p>
-                      <w:pPr>
-                        <w:jc w:val="center"/>
-                        <w:rPr>
-                          <w:b/>
-                          <w:bCs/>
-                          <w:i/>
-                          <w:iCs/>
-                        </w:rPr>
-                      </w:pPr>
-                      <w:r>
-                        <w:rPr>
-                          <w:b/>
-                          <w:bCs/>
-                          <w:i/>
-                          <w:iCs/>
-                        </w:rPr>
-                        <w:t>O</w:t>
-                      </w:r>
-                      <w:r>
-                        <w:rPr>
-                          <w:b/>
-                          <w:bCs/>
-                          <w:i/>
-                          <w:iCs/>
-                        </w:rPr>
-                        <w:t xml:space="preserve">FFICIAL RECEIPT </w:t>
-                      </w:r>
-                      <w:r>
-                        <w:rPr>
-                          <w:b/>
-                          <w:bCs/>
-                          <w:i/>
-                          <w:iCs/>
-                        </w:rPr>
-                        <w:t xml:space="preserve">– </w:t>
-                      </w:r>
-                      <w:r>
-                        <w:rPr>
-                          <w:b/>
-                          <w:bCs/>
-                          <w:i/>
-                          <w:iCs/>
-                        </w:rPr>
-                        <w:t>DUPLICATE</w:t>
-                      </w:r>
-                    </w:p>
-                  </w:txbxContent>
-                </v:textbox>
-                <w10:wrap anchorx="margin" anchory="page"/>
-              </v:shape>
-            </w:pict>
-          </mc:Fallback>
-        </mc:AlternateContent>
-      </w:r>
-      <w:r>
-        <w:rPr>
-          <w:b/>
-          <w:bCs/>
-          <w:noProof/>
-          <w:sz w:val="20"/>
-          <w:szCs w:val="20"/>
-        </w:rPr>
         <w:t xml:space="preserve"> </w:t>
       </w:r>
-    </w:p>
-    <w:p>
-      <w:pPr>
-        <w:tabs>
-          <w:tab w:val="left" w:pos="7418"/>
-        </w:tabs>
-        <w:rPr>
-          <w:b/>
-          <w:bCs/>
-          <w:noProof/>
-          <w:sz w:val="20"/>
-          <w:szCs w:val="20"/>
-        </w:rPr>
-      </w:pPr>
       <w:r>
         <w:rPr>
           <w:b/>
@@ -554,7 +407,6 @@
                 <w:szCs w:val="20"/>
               </w:rPr>
             </w:pPr>
-            <w:proofErr w:type="gramStart"/>
             <w:r>
               <w:rPr>
                 <w:b/>
@@ -586,7 +438,6 @@
               <w:t>{</w:t>
             </w:r>
             <w:proofErr w:type="spellStart"/>
-            <w:proofErr w:type="gramEnd"/>
             <w:r>
               <w:rPr>
                 <w:sz w:val="20"/>
@@ -634,17 +485,7 @@
                 <w:sz w:val="20"/>
                 <w:szCs w:val="20"/>
               </w:rPr>
-              <w:t xml:space="preserve">Facility </w:t>
-            </w:r>
-            <w:proofErr w:type="gramStart"/>
-            <w:r>
-              <w:rPr>
-                <w:b/>
-                <w:bCs/>
-                <w:sz w:val="20"/>
-                <w:szCs w:val="20"/>
-              </w:rPr>
-              <w:t>Name</w:t>
+              <w:t>Facility Name</w:t>
             </w:r>
             <w:r>
               <w:rPr>
@@ -670,7 +511,6 @@
               <w:t>{</w:t>
             </w:r>
             <w:proofErr w:type="spellStart"/>
-            <w:proofErr w:type="gramEnd"/>
             <w:r>
               <w:rPr>
                 <w:sz w:val="20"/>
@@ -716,7 +556,6 @@
               <w:t>Reference/</w:t>
             </w:r>
             <w:proofErr w:type="spellStart"/>
-            <w:proofErr w:type="gramStart"/>
             <w:r>
               <w:rPr>
                 <w:b/>
@@ -760,7 +599,6 @@
               <w:t>{</w:t>
             </w:r>
             <w:proofErr w:type="spellStart"/>
-            <w:proofErr w:type="gramEnd"/>
             <w:r>
               <w:rPr>
                 <w:sz w:val="20"/>
@@ -808,7 +646,6 @@
                 <w:szCs w:val="20"/>
               </w:rPr>
             </w:pPr>
-            <w:proofErr w:type="gramStart"/>
             <w:r>
               <w:rPr>
                 <w:b/>
@@ -833,7 +670,6 @@
               <w:t>{{</w:t>
             </w:r>
             <w:proofErr w:type="spellStart"/>
-            <w:proofErr w:type="gramEnd"/>
             <w:r>
               <w:rPr>
                 <w:sz w:val="20"/>
@@ -999,17 +835,7 @@
                 <w:sz w:val="20"/>
                 <w:szCs w:val="20"/>
               </w:rPr>
-              <w:t xml:space="preserve">Payment </w:t>
-            </w:r>
-            <w:proofErr w:type="gramStart"/>
-            <w:r>
-              <w:rPr>
-                <w:b/>
-                <w:bCs/>
-                <w:sz w:val="20"/>
-                <w:szCs w:val="20"/>
-              </w:rPr>
-              <w:t>Date:</w:t>
+              <w:t>Payment Date:</w:t>
             </w:r>
             <w:r>
               <w:rPr>
@@ -1033,7 +859,6 @@
               <w:t>{</w:t>
             </w:r>
             <w:proofErr w:type="spellStart"/>
-            <w:proofErr w:type="gramEnd"/>
             <w:r>
               <w:rPr>
                 <w:sz w:val="20"/>
@@ -1094,17 +919,7 @@
                 <w:sz w:val="20"/>
                 <w:szCs w:val="20"/>
               </w:rPr>
-              <w:t xml:space="preserve">Generated </w:t>
-            </w:r>
-            <w:proofErr w:type="gramStart"/>
-            <w:r>
-              <w:rPr>
-                <w:b/>
-                <w:bCs/>
-                <w:sz w:val="20"/>
-                <w:szCs w:val="20"/>
-              </w:rPr>
-              <w:t>Date:</w:t>
+              <w:t>Generated Date:</w:t>
             </w:r>
             <w:r>
               <w:rPr>
@@ -1128,7 +943,6 @@
               <w:t>{</w:t>
             </w:r>
             <w:proofErr w:type="spellStart"/>
-            <w:proofErr w:type="gramEnd"/>
             <w:r>
               <w:rPr>
                 <w:sz w:val="20"/>
@@ -2039,7 +1853,11 @@
           </mc:Choice>
           <mc:Fallback>
             <w:pict>
-              <v:shape w14:anchorId="015BE9BB" id="_x0000_s1027" type="#_x0000_t202" style="position:absolute;left:0;text-align:left;margin-left:341pt;margin-top:573pt;width:185.4pt;height:22pt;z-index:251658244;visibility:visible;mso-wrap-style:square;mso-width-percent:400;mso-height-percent:0;mso-wrap-distance-left:9pt;mso-wrap-distance-top:3.6pt;mso-wrap-distance-right:9pt;mso-wrap-distance-bottom:3.6pt;mso-position-horizontal:absolute;mso-position-horizontal-relative:text;mso-position-vertical:absolute;mso-position-vertical-relative:page;mso-width-percent:400;mso-height-percent:0;mso-width-relative:margin;mso-height-relative:margin;v-text-anchor:top" o:gfxdata="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" strokecolor="white [3212]">
+              <v:shapetype w14:anchorId="015BE9BB" id="_x0000_t202" coordsize="21600,21600" o:spt="202" path="m,l,21600r21600,l21600,xe">
+                <v:stroke joinstyle="miter"/>
+                <v:path gradientshapeok="t" o:connecttype="rect"/>
+              </v:shapetype>
+              <v:shape id="Text Box 2" o:spid="_x0000_s1026" type="#_x0000_t202" style="position:absolute;left:0;text-align:left;margin-left:341pt;margin-top:573pt;width:185.4pt;height:22pt;z-index:251658244;visibility:visible;mso-wrap-style:square;mso-width-percent:400;mso-height-percent:0;mso-wrap-distance-left:9pt;mso-wrap-distance-top:3.6pt;mso-wrap-distance-right:9pt;mso-wrap-distance-bottom:3.6pt;mso-position-horizontal:absolute;mso-position-horizontal-relative:text;mso-position-vertical:absolute;mso-position-vertical-relative:page;mso-width-percent:400;mso-height-percent:0;mso-width-relative:margin;mso-height-relative:margin;v-text-anchor:top" o:gfxdata="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" strokecolor="white [3212]">
                 <v:textbox>
                   <w:txbxContent>
                     <w:p>
@@ -2204,7 +2022,7 @@
           </mc:Choice>
           <mc:Fallback>
             <w:pict>
-              <v:shape w14:anchorId="790CA2F1" id="_x0000_s1028" type="#_x0000_t202" style="position:absolute;left:0;text-align:left;margin-left:89.35pt;margin-top:692.65pt;width:4in;height:87.6pt;z-index:251658243;visibility:visible;mso-wrap-style:square;mso-width-percent:0;mso-height-percent:0;mso-wrap-distance-left:9pt;mso-wrap-distance-top:3.6pt;mso-wrap-distance-right:9pt;mso-wrap-distance-bottom:3.6pt;mso-position-horizontal:absolute;mso-position-horizontal-relative:text;mso-position-vertical:absolute;mso-position-vertical-relative:page;mso-width-percent:0;mso-height-percent:0;mso-width-relative:margin;mso-height-relative:margin;v-text-anchor:top" o:gfxdata="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" strokecolor="white [3212]">
+              <v:shape w14:anchorId="790CA2F1" id="_x0000_s1027" type="#_x0000_t202" style="position:absolute;left:0;text-align:left;margin-left:89.35pt;margin-top:692.65pt;width:4in;height:87.6pt;z-index:251658243;visibility:visible;mso-wrap-style:square;mso-width-percent:0;mso-height-percent:0;mso-wrap-distance-left:9pt;mso-wrap-distance-top:3.6pt;mso-wrap-distance-right:9pt;mso-wrap-distance-bottom:3.6pt;mso-position-horizontal:absolute;mso-position-horizontal-relative:text;mso-position-vertical:absolute;mso-position-vertical-relative:page;mso-width-percent:0;mso-height-percent:0;mso-width-relative:margin;mso-height-relative:margin;v-text-anchor:top" o:gfxdata="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" strokecolor="white [3212]">
                 <v:textbox>
                   <w:txbxContent>
                     <w:p>
@@ -3005,7 +2823,6 @@
   <w:style w:type="character" w:default="1" w:styleId="DefaultParagraphFont">
     <w:name w:val="Default Paragraph Font"/>
     <w:uiPriority w:val="1"/>
-    <w:semiHidden/>
     <w:unhideWhenUsed/>
   </w:style>
   <w:style w:type="table" w:default="1" w:styleId="TableNormal">
@@ -3829,15 +3646,6 @@
 </file>
 
 <file path=customXml/item1.xml><?xml version="1.0" encoding="utf-8"?>
-<?mso-contentType ?>
-<FormTemplates xmlns="http://schemas.microsoft.com/sharepoint/v3/contenttype/forms">
-  <Display>DocumentLibraryForm</Display>
-  <Edit>DocumentLibraryForm</Edit>
-  <New>DocumentLibraryForm</New>
-</FormTemplates>
-</file>
-
-<file path=customXml/item2.xml><?xml version="1.0" encoding="utf-8"?>
 <ct:contentTypeSchema xmlns:ct="http://schemas.microsoft.com/office/2006/metadata/contentType" xmlns:ma="http://schemas.microsoft.com/office/2006/metadata/properties/metaAttributes" ct:_="" ma:_="" ma:contentTypeName="Document" ma:contentTypeID="0x01010015F16144C0593A4A82C8AE0B67DB460F" ma:contentTypeVersion="11" ma:contentTypeDescription="Create a new document." ma:contentTypeScope="" ma:versionID="3a2406281bee02c64b898b19359b591a">
   <xsd:schema xmlns:xsd="http://www.w3.org/2001/XMLSchema" xmlns:xs="http://www.w3.org/2001/XMLSchema" xmlns:p="http://schemas.microsoft.com/office/2006/metadata/properties" xmlns:ns2="94d5cf59-5162-48bc-aa9b-620df72947f5" xmlns:ns3="8350b7c0-334b-4e19-bfc1-744f6a979eee" targetNamespace="http://schemas.microsoft.com/office/2006/metadata/properties" ma:root="true" ma:fieldsID="a1c36f1dd46451d6740df434f8fe57b2" ns2:_="" ns3:_="">
     <xsd:import namespace="94d5cf59-5162-48bc-aa9b-620df72947f5"/>
@@ -4032,6 +3840,15 @@
 </ct:contentTypeSchema>
 </file>
 
+<file path=customXml/item2.xml><?xml version="1.0" encoding="utf-8"?>
+<?mso-contentType ?>
+<FormTemplates xmlns="http://schemas.microsoft.com/sharepoint/v3/contenttype/forms">
+  <Display>DocumentLibraryForm</Display>
+  <Edit>DocumentLibraryForm</Edit>
+  <New>DocumentLibraryForm</New>
+</FormTemplates>
+</file>
+
 <file path=customXml/item3.xml><?xml version="1.0" encoding="utf-8"?>
 <p:properties xmlns:p="http://schemas.microsoft.com/office/2006/metadata/properties" xmlns:xsi="http://www.w3.org/2001/XMLSchema-instance" xmlns:pc="http://schemas.microsoft.com/office/infopath/2007/PartnerControls">
   <documentManagement>
@@ -4044,14 +3861,6 @@
 </file>
 
 <file path=customXml/itemProps1.xml><?xml version="1.0" encoding="utf-8"?>
-<ds:datastoreItem xmlns:ds="http://schemas.openxmlformats.org/officeDocument/2006/customXml" ds:itemID="{706274D2-3047-4942-959A-14C0841D4E7A}">
-  <ds:schemaRefs>
-    <ds:schemaRef ds:uri="http://schemas.microsoft.com/sharepoint/v3/contenttype/forms"/>
-  </ds:schemaRefs>
-</ds:datastoreItem>
-</file>
-
-<file path=customXml/itemProps2.xml><?xml version="1.0" encoding="utf-8"?>
 <ds:datastoreItem xmlns:ds="http://schemas.openxmlformats.org/officeDocument/2006/customXml" ds:itemID="{02AC0E96-7646-4B76-87B4-939C7B2F1930}">
   <ds:schemaRefs>
     <ds:schemaRef ds:uri="http://schemas.microsoft.com/office/2006/metadata/contentType"/>
@@ -4070,6 +3879,14 @@
 </ds:datastoreItem>
 </file>
 
+<file path=customXml/itemProps2.xml><?xml version="1.0" encoding="utf-8"?>
+<ds:datastoreItem xmlns:ds="http://schemas.openxmlformats.org/officeDocument/2006/customXml" ds:itemID="{706274D2-3047-4942-959A-14C0841D4E7A}">
+  <ds:schemaRefs>
+    <ds:schemaRef ds:uri="http://schemas.microsoft.com/sharepoint/v3/contenttype/forms"/>
+  </ds:schemaRefs>
+</ds:datastoreItem>
+</file>
+
 <file path=customXml/itemProps3.xml><?xml version="1.0" encoding="utf-8"?>
 <ds:datastoreItem xmlns:ds="http://schemas.openxmlformats.org/officeDocument/2006/customXml" ds:itemID="{EE5A115D-6B26-41B0-BA7A-CA777623D511}">
   <ds:schemaRefs>

</xml_diff>